<commit_message>
your commit message here
</commit_message>
<xml_diff>
--- a/AnushmitaDas_ProjectReport.docx
+++ b/AnushmitaDas_ProjectReport.docx
@@ -814,6 +814,62 @@
     </w:p>
     <w:p>
       <w:pPr>
+        <w:spacing w:line="240" w:lineRule="auto"/>
+      </w:pPr>
+      <w:r>
+        <w:rPr/>
+        <w:drawing>
+          <wp:inline distT="0" distB="0" distL="0" distR="0">
+            <wp:extent cx="5400000" cy="2107931"/>
+            <wp:effectExtent l="0" t="0" r="0" b="0"/>
+            <wp:docPr id="1" name="graph_00.png" descr=""/>
+            <wp:cNvGraphicFramePr>
+              <a:graphicFrameLocks noChangeAspect="1"/>
+            </wp:cNvGraphicFramePr>
+            <a:graphic>
+              <a:graphicData uri="http://schemas.openxmlformats.org/drawingml/2006/picture">
+                <pic:pic>
+                  <pic:nvPicPr>
+                    <pic:cNvPr id="1" name="graph_00.png"/>
+                    <pic:cNvPicPr/>
+                  </pic:nvPicPr>
+                  <pic:blipFill>
+                    <a:blip r:embed="R81add62515484962" cstate="print"/>
+                    <a:stretch>
+                      <a:fillRect/>
+                    </a:stretch>
+                  </pic:blipFill>
+                  <pic:spPr>
+                    <a:xfrm>
+                      <a:off x="0" y="0"/>
+                      <a:ext cx="5400000" cy="2107931"/>
+                    </a:xfrm>
+                    <a:prstGeom prst="rect">
+                      <a:avLst/>
+                    </a:prstGeom>
+                  </pic:spPr>
+                </pic:pic>
+              </a:graphicData>
+            </a:graphic>
+          </wp:inline>
+        </w:drawing>
+      </w:r>
+    </w:p>
+    <w:p>
+      <w:pPr>
+        <w:pStyle w:val="Caption"/>
+        <w:spacing w:after="120"/>
+        <w:jc w:val="center"/>
+      </w:pPr>
+      <w:r>
+        <w:rPr>
+          <w:i/>
+        </w:rPr>
+        <w:t xml:space="preserve">Figure: Missing Value Counts per Column</w:t>
+      </w:r>
+    </w:p>
+    <w:p>
+      <w:pPr>
         <w:pStyle w:val="Heading1"/>
         <w:spacing w:before="320" w:after="160"/>
       </w:pPr>
@@ -1280,6 +1336,61 @@
     </w:p>
     <w:p>
       <w:pPr>
+        <w:spacing w:line="240" w:lineRule="auto"/>
+      </w:pPr>
+      <w:r>
+        <w:drawing>
+          <wp:inline distT="0" distB="0" distL="0" distR="0">
+            <wp:extent cx="4320000" cy="1799596"/>
+            <wp:effectExtent l="0" t="0" r="0" b="0"/>
+            <wp:docPr id="10" name="graph_09.png" descr=""/>
+            <wp:cNvGraphicFramePr>
+              <a:graphicFrameLocks noChangeAspect="1"/>
+            </wp:cNvGraphicFramePr>
+            <a:graphic>
+              <a:graphicData uri="http://schemas.openxmlformats.org/drawingml/2006/picture">
+                <pic:pic>
+                  <pic:nvPicPr>
+                    <pic:cNvPr id="10" name="graph_09.png"/>
+                    <pic:cNvPicPr/>
+                  </pic:nvPicPr>
+                  <pic:blipFill>
+                    <a:blip r:embed="R6b7e9a70fc8c4a44" cstate="print"/>
+                    <a:stretch>
+                      <a:fillRect/>
+                    </a:stretch>
+                  </pic:blipFill>
+                  <pic:spPr>
+                    <a:xfrm>
+                      <a:off x="0" y="0"/>
+                      <a:ext cx="4320000" cy="1799596"/>
+                    </a:xfrm>
+                    <a:prstGeom prst="rect">
+                      <a:avLst/>
+                    </a:prstGeom>
+                  </pic:spPr>
+                </pic:pic>
+              </a:graphicData>
+            </a:graphic>
+          </wp:inline>
+        </w:drawing>
+      </w:r>
+    </w:p>
+    <w:p>
+      <w:pPr>
+        <w:pStyle w:val="Caption"/>
+        <w:spacing w:after="120"/>
+        <w:jc w:val="center"/>
+      </w:pPr>
+      <w:r>
+        <w:rPr>
+          <w:i/>
+        </w:rPr>
+        <w:t xml:space="preserve">Figure 4.1: Train / Test Split Visualisation (80 / 20)</w:t>
+      </w:r>
+    </w:p>
+    <w:p>
+      <w:pPr>
         <w:pStyle w:val="Heading1"/>
         <w:spacing w:before="320" w:after="160"/>
       </w:pPr>
@@ -1315,7 +1426,63 @@
     </w:p>
     <w:p>
       <w:pPr>
+        <w:spacing w:line="240" w:lineRule="auto"/>
+      </w:pPr>
+      <w:r>
+        <w:rPr/>
+        <w:drawing>
+          <wp:inline distT="0" distB="0" distL="0" distR="0">
+            <wp:extent cx="5400000" cy="1997670"/>
+            <wp:effectExtent l="0" t="0" r="0" b="0"/>
+            <wp:docPr id="2" name="graph_01.png" descr=""/>
+            <wp:cNvGraphicFramePr>
+              <a:graphicFrameLocks noChangeAspect="1"/>
+            </wp:cNvGraphicFramePr>
+            <a:graphic>
+              <a:graphicData uri="http://schemas.openxmlformats.org/drawingml/2006/picture">
+                <pic:pic>
+                  <pic:nvPicPr>
+                    <pic:cNvPr id="2" name="graph_01.png"/>
+                    <pic:cNvPicPr/>
+                  </pic:nvPicPr>
+                  <pic:blipFill>
+                    <a:blip r:embed="R82482181654b48ea" cstate="print"/>
+                    <a:stretch>
+                      <a:fillRect/>
+                    </a:stretch>
+                  </pic:blipFill>
+                  <pic:spPr>
+                    <a:xfrm>
+                      <a:off x="0" y="0"/>
+                      <a:ext cx="5400000" cy="1997670"/>
+                    </a:xfrm>
+                    <a:prstGeom prst="rect">
+                      <a:avLst/>
+                    </a:prstGeom>
+                  </pic:spPr>
+                </pic:pic>
+              </a:graphicData>
+            </a:graphic>
+          </wp:inline>
+        </w:drawing>
+      </w:r>
+    </w:p>
+    <w:p>
+      <w:pPr>
+        <w:pStyle w:val="Caption"/>
         <w:spacing w:after="120"/>
+        <w:jc w:val="center"/>
+      </w:pPr>
+      <w:r>
+        <w:rPr>
+          <w:i/>
+        </w:rPr>
+        <w:t xml:space="preserve">Figure 6.1: Price Distribution — Histogram with KDE and Box Plot</w:t>
+      </w:r>
+    </w:p>
+    <w:p>
+      <w:pPr>
+        <w:spacing w:after="120"/>
       </w:pPr>
       <w:r>
         <w:rPr>
@@ -1326,7 +1493,63 @@
     </w:p>
     <w:p>
       <w:pPr>
+        <w:spacing w:line="240" w:lineRule="auto"/>
+      </w:pPr>
+      <w:r>
+        <w:rPr/>
+        <w:drawing>
+          <wp:inline distT="0" distB="0" distL="0" distR="0">
+            <wp:extent cx="5400000" cy="2135403"/>
+            <wp:effectExtent l="0" t="0" r="0" b="0"/>
+            <wp:docPr id="3" name="graph_02.png" descr=""/>
+            <wp:cNvGraphicFramePr>
+              <a:graphicFrameLocks noChangeAspect="1"/>
+            </wp:cNvGraphicFramePr>
+            <a:graphic>
+              <a:graphicData uri="http://schemas.openxmlformats.org/drawingml/2006/picture">
+                <pic:pic>
+                  <pic:nvPicPr>
+                    <pic:cNvPr id="3" name="graph_02.png"/>
+                    <pic:cNvPicPr/>
+                  </pic:nvPicPr>
+                  <pic:blipFill>
+                    <a:blip r:embed="Rae6f74f57c054d37" cstate="print"/>
+                    <a:stretch>
+                      <a:fillRect/>
+                    </a:stretch>
+                  </pic:blipFill>
+                  <pic:spPr>
+                    <a:xfrm>
+                      <a:off x="0" y="0"/>
+                      <a:ext cx="5400000" cy="2135403"/>
+                    </a:xfrm>
+                    <a:prstGeom prst="rect">
+                      <a:avLst/>
+                    </a:prstGeom>
+                  </pic:spPr>
+                </pic:pic>
+              </a:graphicData>
+            </a:graphic>
+          </wp:inline>
+        </w:drawing>
+      </w:r>
+    </w:p>
+    <w:p>
+      <w:pPr>
+        <w:pStyle w:val="Caption"/>
         <w:spacing w:after="120"/>
+        <w:jc w:val="center"/>
+      </w:pPr>
+      <w:r>
+        <w:rPr>
+          <w:i/>
+        </w:rPr>
+        <w:t xml:space="preserve">Figure 6.2: Average Car Price by Make</w:t>
+      </w:r>
+    </w:p>
+    <w:p>
+      <w:pPr>
+        <w:spacing w:after="120"/>
       </w:pPr>
       <w:r>
         <w:rPr>
@@ -1337,7 +1560,117 @@
     </w:p>
     <w:p>
       <w:pPr>
+        <w:pStyle w:val="Caption"/>
         <w:spacing w:after="120"/>
+        <w:jc w:val="center"/>
+      </w:pPr>
+      <w:r>
+        <w:rPr>
+          <w:i/>
+        </w:rPr>
+        <w:t xml:space="preserve">Figure 6.3b: Top 10 Feature Correlations with Price</w:t>
+      </w:r>
+    </w:p>
+    <w:p>
+      <w:pPr>
+        <w:spacing w:line="240" w:lineRule="auto"/>
+      </w:pPr>
+      <w:r>
+        <w:drawing>
+          <wp:inline distT="0" distB="0" distL="0" distR="0">
+            <wp:extent cx="4680000" cy="2299968"/>
+            <wp:effectExtent l="0" t="0" r="0" b="0"/>
+            <wp:docPr id="5" name="graph_04.png" descr=""/>
+            <wp:cNvGraphicFramePr>
+              <a:graphicFrameLocks noChangeAspect="1"/>
+            </wp:cNvGraphicFramePr>
+            <a:graphic>
+              <a:graphicData uri="http://schemas.openxmlformats.org/drawingml/2006/picture">
+                <pic:pic>
+                  <pic:nvPicPr>
+                    <pic:cNvPr id="5" name="graph_04.png"/>
+                    <pic:cNvPicPr/>
+                  </pic:nvPicPr>
+                  <pic:blipFill>
+                    <a:blip r:embed="R4a3c6ab36b0c4b6e" cstate="print"/>
+                    <a:stretch>
+                      <a:fillRect/>
+                    </a:stretch>
+                  </pic:blipFill>
+                  <pic:spPr>
+                    <a:xfrm>
+                      <a:off x="0" y="0"/>
+                      <a:ext cx="4680000" cy="2299968"/>
+                    </a:xfrm>
+                    <a:prstGeom prst="rect">
+                      <a:avLst/>
+                    </a:prstGeom>
+                  </pic:spPr>
+                </pic:pic>
+              </a:graphicData>
+            </a:graphic>
+          </wp:inline>
+        </w:drawing>
+      </w:r>
+    </w:p>
+    <w:p>
+      <w:pPr>
+        <w:pStyle w:val="Caption"/>
+        <w:spacing w:after="120"/>
+        <w:jc w:val="center"/>
+      </w:pPr>
+      <w:r>
+        <w:rPr>
+          <w:i/>
+        </w:rPr>
+        <w:t xml:space="preserve">Figure 6.3a: Correlation Matrix — Numeric Features</w:t>
+      </w:r>
+    </w:p>
+    <w:p>
+      <w:pPr>
+        <w:spacing w:line="240" w:lineRule="auto"/>
+      </w:pPr>
+      <w:r>
+        <w:drawing>
+          <wp:inline distT="0" distB="0" distL="0" distR="0">
+            <wp:extent cx="5400000" cy="4128272"/>
+            <wp:effectExtent l="0" t="0" r="0" b="0"/>
+            <wp:docPr id="4" name="graph_03.png" descr=""/>
+            <wp:cNvGraphicFramePr>
+              <a:graphicFrameLocks noChangeAspect="1"/>
+            </wp:cNvGraphicFramePr>
+            <a:graphic>
+              <a:graphicData uri="http://schemas.openxmlformats.org/drawingml/2006/picture">
+                <pic:pic>
+                  <pic:nvPicPr>
+                    <pic:cNvPr id="4" name="graph_03.png"/>
+                    <pic:cNvPicPr/>
+                  </pic:nvPicPr>
+                  <pic:blipFill>
+                    <a:blip r:embed="R340c359e44f540b8" cstate="print"/>
+                    <a:stretch>
+                      <a:fillRect/>
+                    </a:stretch>
+                  </pic:blipFill>
+                  <pic:spPr>
+                    <a:xfrm>
+                      <a:off x="0" y="0"/>
+                      <a:ext cx="5400000" cy="4128272"/>
+                    </a:xfrm>
+                    <a:prstGeom prst="rect">
+                      <a:avLst/>
+                    </a:prstGeom>
+                  </pic:spPr>
+                </pic:pic>
+              </a:graphicData>
+            </a:graphic>
+          </wp:inline>
+        </w:drawing>
+      </w:r>
+    </w:p>
+    <w:p>
+      <w:pPr>
+        <w:spacing w:after="120"/>
       </w:pPr>
       <w:r>
         <w:rPr>
@@ -1348,7 +1681,62 @@
     </w:p>
     <w:p>
       <w:pPr>
+        <w:spacing w:line="240" w:lineRule="auto"/>
+      </w:pPr>
+      <w:r>
+        <w:drawing>
+          <wp:inline distT="0" distB="0" distL="0" distR="0">
+            <wp:extent cx="5400000" cy="3107423"/>
+            <wp:effectExtent l="0" t="0" r="0" b="0"/>
+            <wp:docPr id="6" name="graph_05.png" descr=""/>
+            <wp:cNvGraphicFramePr>
+              <a:graphicFrameLocks noChangeAspect="1"/>
+            </wp:cNvGraphicFramePr>
+            <a:graphic>
+              <a:graphicData uri="http://schemas.openxmlformats.org/drawingml/2006/picture">
+                <pic:pic>
+                  <pic:nvPicPr>
+                    <pic:cNvPr id="6" name="graph_05.png"/>
+                    <pic:cNvPicPr/>
+                  </pic:nvPicPr>
+                  <pic:blipFill>
+                    <a:blip r:embed="R04250eb8874548aa" cstate="print"/>
+                    <a:stretch>
+                      <a:fillRect/>
+                    </a:stretch>
+                  </pic:blipFill>
+                  <pic:spPr>
+                    <a:xfrm>
+                      <a:off x="0" y="0"/>
+                      <a:ext cx="5400000" cy="3107423"/>
+                    </a:xfrm>
+                    <a:prstGeom prst="rect">
+                      <a:avLst/>
+                    </a:prstGeom>
+                  </pic:spPr>
+                </pic:pic>
+              </a:graphicData>
+            </a:graphic>
+          </wp:inline>
+        </w:drawing>
+      </w:r>
+    </w:p>
+    <w:p>
+      <w:pPr>
+        <w:pStyle w:val="Caption"/>
         <w:spacing w:after="120"/>
+        <w:jc w:val="center"/>
+      </w:pPr>
+      <w:r>
+        <w:rPr>
+          <w:i/>
+        </w:rPr>
+        <w:t xml:space="preserve">Figure 6.4: Top Numeric Features vs. Car Price (Scatter Plots)</w:t>
+      </w:r>
+    </w:p>
+    <w:p>
+      <w:pPr>
+        <w:spacing w:after="120"/>
       </w:pPr>
       <w:r>
         <w:rPr>
@@ -1359,6 +1747,61 @@
     </w:p>
     <w:p>
       <w:pPr>
+        <w:spacing w:line="240" w:lineRule="auto"/>
+      </w:pPr>
+      <w:r>
+        <w:drawing>
+          <wp:inline distT="0" distB="0" distL="0" distR="0">
+            <wp:extent cx="5400000" cy="1899889"/>
+            <wp:effectExtent l="0" t="0" r="0" b="0"/>
+            <wp:docPr id="7" name="graph_06.png" descr=""/>
+            <wp:cNvGraphicFramePr>
+              <a:graphicFrameLocks noChangeAspect="1"/>
+            </wp:cNvGraphicFramePr>
+            <a:graphic>
+              <a:graphicData uri="http://schemas.openxmlformats.org/drawingml/2006/picture">
+                <pic:pic>
+                  <pic:nvPicPr>
+                    <pic:cNvPr id="7" name="graph_06.png"/>
+                    <pic:cNvPicPr/>
+                  </pic:nvPicPr>
+                  <pic:blipFill>
+                    <a:blip r:embed="R49f8077bdbac480e" cstate="print"/>
+                    <a:stretch>
+                      <a:fillRect/>
+                    </a:stretch>
+                  </pic:blipFill>
+                  <pic:spPr>
+                    <a:xfrm>
+                      <a:off x="0" y="0"/>
+                      <a:ext cx="5400000" cy="1899889"/>
+                    </a:xfrm>
+                    <a:prstGeom prst="rect">
+                      <a:avLst/>
+                    </a:prstGeom>
+                  </pic:spPr>
+                </pic:pic>
+              </a:graphicData>
+            </a:graphic>
+          </wp:inline>
+        </w:drawing>
+      </w:r>
+    </w:p>
+    <w:p>
+      <w:pPr>
+        <w:pStyle w:val="Caption"/>
+        <w:spacing w:after="120"/>
+        <w:jc w:val="center"/>
+      </w:pPr>
+      <w:r>
+        <w:rPr>
+          <w:i/>
+        </w:rPr>
+        <w:t xml:space="preserve">Figure 6.5: Price by Body Style and Fuel Type</w:t>
+      </w:r>
+    </w:p>
+    <w:p>
+      <w:pPr>
         <w:spacing w:after="160"/>
       </w:pPr>
       <w:r>
@@ -1366,6 +1809,116 @@
           <w:sz w:val="22"/>
         </w:rPr>
         <w:t xml:space="preserve">6.6 Categorical Count Plots — Count plots for 8 categorical features reveal class imbalances (e.g. sedan is the dominant body style; gas is the dominant fuel type).</w:t>
+      </w:r>
+    </w:p>
+    <w:p>
+      <w:pPr>
+        <w:spacing w:line="240" w:lineRule="auto"/>
+      </w:pPr>
+      <w:r>
+        <w:drawing>
+          <wp:inline distT="0" distB="0" distL="0" distR="0">
+            <wp:extent cx="5400000" cy="2460051"/>
+            <wp:effectExtent l="0" t="0" r="0" b="0"/>
+            <wp:docPr id="9" name="graph_07.png" descr=""/>
+            <wp:cNvGraphicFramePr>
+              <a:graphicFrameLocks noChangeAspect="1"/>
+            </wp:cNvGraphicFramePr>
+            <a:graphic>
+              <a:graphicData uri="http://schemas.openxmlformats.org/drawingml/2006/picture">
+                <pic:pic>
+                  <pic:nvPicPr>
+                    <pic:cNvPr id="9" name="graph_07.png"/>
+                    <pic:cNvPicPr/>
+                  </pic:nvPicPr>
+                  <pic:blipFill>
+                    <a:blip r:embed="R07ca0084a6d74ffd" cstate="print"/>
+                    <a:stretch>
+                      <a:fillRect/>
+                    </a:stretch>
+                  </pic:blipFill>
+                  <pic:spPr>
+                    <a:xfrm>
+                      <a:off x="0" y="0"/>
+                      <a:ext cx="5400000" cy="2460051"/>
+                    </a:xfrm>
+                    <a:prstGeom prst="rect">
+                      <a:avLst/>
+                    </a:prstGeom>
+                  </pic:spPr>
+                </pic:pic>
+              </a:graphicData>
+            </a:graphic>
+          </wp:inline>
+        </w:drawing>
+      </w:r>
+    </w:p>
+    <w:p>
+      <w:pPr>
+        <w:pStyle w:val="Caption"/>
+        <w:spacing w:after="120"/>
+        <w:jc w:val="center"/>
+      </w:pPr>
+      <w:r>
+        <w:rPr>
+          <w:i/>
+        </w:rPr>
+        <w:t xml:space="preserve">Figure 6.6a: Categorical Feature Distributions (Count Plots)</w:t>
+      </w:r>
+    </w:p>
+    <w:p>
+      <w:pPr>
+        <w:spacing w:line="240" w:lineRule="auto"/>
+      </w:pPr>
+      <w:r>
+        <w:drawing>
+          <wp:inline distT="0" distB="0" distL="0" distR="0">
+            <wp:extent cx="4680000" cy="2567500"/>
+            <wp:effectExtent l="0" t="0" r="0" b="0"/>
+            <wp:docPr id="8" name="graph_08.png" descr=""/>
+            <wp:cNvGraphicFramePr>
+              <a:graphicFrameLocks noChangeAspect="1"/>
+            </wp:cNvGraphicFramePr>
+            <a:graphic>
+              <a:graphicData uri="http://schemas.openxmlformats.org/drawingml/2006/picture">
+                <pic:pic>
+                  <pic:nvPicPr>
+                    <pic:cNvPr id="8" name="graph_08.png"/>
+                    <pic:cNvPicPr/>
+                  </pic:nvPicPr>
+                  <pic:blipFill>
+                    <a:blip r:embed="Rc56b3ec26b7942fc" cstate="print"/>
+                    <a:stretch>
+                      <a:fillRect/>
+                    </a:stretch>
+                  </pic:blipFill>
+                  <pic:spPr>
+                    <a:xfrm>
+                      <a:off x="0" y="0"/>
+                      <a:ext cx="4680000" cy="2567500"/>
+                    </a:xfrm>
+                    <a:prstGeom prst="rect">
+                      <a:avLst/>
+                    </a:prstGeom>
+                  </pic:spPr>
+                </pic:pic>
+              </a:graphicData>
+            </a:graphic>
+          </wp:inline>
+        </w:drawing>
+      </w:r>
+    </w:p>
+    <w:p>
+      <w:pPr>
+        <w:pStyle w:val="Caption"/>
+        <w:spacing w:after="120"/>
+        <w:jc w:val="center"/>
+      </w:pPr>
+      <w:r>
+        <w:rPr>
+          <w:i/>
+        </w:rPr>
+        <w:t xml:space="preserve">Figure 6.6b: Price Distribution by Drive Wheels (Violin Plot)</w:t>
       </w:r>
     </w:p>
     <w:p>
@@ -1478,6 +2031,61 @@
           <w:sz w:val="22"/>
         </w:rPr>
         <w:t xml:space="preserve">All 25 original features are retained for model training; feature selection is used only for interpretability analysis.</w:t>
+      </w:r>
+    </w:p>
+    <w:p>
+      <w:pPr>
+        <w:spacing w:line="240" w:lineRule="auto"/>
+      </w:pPr>
+      <w:r>
+        <w:drawing>
+          <wp:inline distT="0" distB="0" distL="0" distR="0">
+            <wp:extent cx="5040000" cy="3640197"/>
+            <wp:effectExtent l="0" t="0" r="0" b="0"/>
+            <wp:docPr id="11" name="graph_10.png" descr=""/>
+            <wp:cNvGraphicFramePr>
+              <a:graphicFrameLocks noChangeAspect="1"/>
+            </wp:cNvGraphicFramePr>
+            <a:graphic>
+              <a:graphicData uri="http://schemas.openxmlformats.org/drawingml/2006/picture">
+                <pic:pic>
+                  <pic:nvPicPr>
+                    <pic:cNvPr id="11" name="graph_10.png"/>
+                    <pic:cNvPicPr/>
+                  </pic:nvPicPr>
+                  <pic:blipFill>
+                    <a:blip r:embed="Rf053a9a6d428409e" cstate="print"/>
+                    <a:stretch>
+                      <a:fillRect/>
+                    </a:stretch>
+                  </pic:blipFill>
+                  <pic:spPr>
+                    <a:xfrm>
+                      <a:off x="0" y="0"/>
+                      <a:ext cx="5040000" cy="3640197"/>
+                    </a:xfrm>
+                    <a:prstGeom prst="rect">
+                      <a:avLst/>
+                    </a:prstGeom>
+                  </pic:spPr>
+                </pic:pic>
+              </a:graphicData>
+            </a:graphic>
+          </wp:inline>
+        </w:drawing>
+      </w:r>
+    </w:p>
+    <w:p>
+      <w:pPr>
+        <w:pStyle w:val="Caption"/>
+        <w:spacing w:after="120"/>
+        <w:jc w:val="center"/>
+      </w:pPr>
+      <w:r>
+        <w:rPr>
+          <w:i/>
+        </w:rPr>
+        <w:t xml:space="preserve">Figure 7.1: Top 20 Feature Importances (Extra Trees Regressor)</w:t>
       </w:r>
     </w:p>
     <w:p>
@@ -2029,6 +2637,116 @@
         <w:t xml:space="preserve">Total combinations evaluated: 2 × 3 × 2 × 2 × 2 × 5 folds = 240 fits. The best configuration is selected by maximising mean CV R² score. The tuned model is then re-evaluated on the held-out test set and compared against the untuned baseline.</w:t>
       </w:r>
     </w:p>
+    <w:p>
+      <w:pPr>
+        <w:spacing w:line="240" w:lineRule="auto"/>
+      </w:pPr>
+      <w:r>
+        <w:drawing>
+          <wp:inline distT="0" distB="0" distL="0" distR="0">
+            <wp:extent cx="5040000" cy="1640778"/>
+            <wp:effectExtent l="0" t="0" r="0" b="0"/>
+            <wp:docPr id="19" name="graph_18.png" descr=""/>
+            <wp:cNvGraphicFramePr>
+              <a:graphicFrameLocks noChangeAspect="1"/>
+            </wp:cNvGraphicFramePr>
+            <a:graphic>
+              <a:graphicData uri="http://schemas.openxmlformats.org/drawingml/2006/picture">
+                <pic:pic>
+                  <pic:nvPicPr>
+                    <pic:cNvPr id="19" name="graph_18.png"/>
+                    <pic:cNvPicPr/>
+                  </pic:nvPicPr>
+                  <pic:blipFill>
+                    <a:blip r:embed="Re2f17c10875d4530" cstate="print"/>
+                    <a:stretch>
+                      <a:fillRect/>
+                    </a:stretch>
+                  </pic:blipFill>
+                  <pic:spPr>
+                    <a:xfrm>
+                      <a:off x="0" y="0"/>
+                      <a:ext cx="5040000" cy="1640778"/>
+                    </a:xfrm>
+                    <a:prstGeom prst="rect">
+                      <a:avLst/>
+                    </a:prstGeom>
+                  </pic:spPr>
+                </pic:pic>
+              </a:graphicData>
+            </a:graphic>
+          </wp:inline>
+        </w:drawing>
+      </w:r>
+    </w:p>
+    <w:p>
+      <w:pPr>
+        <w:pStyle w:val="Caption"/>
+        <w:spacing w:after="120"/>
+        <w:jc w:val="center"/>
+      </w:pPr>
+      <w:r>
+        <w:rPr>
+          <w:i/>
+        </w:rPr>
+        <w:t xml:space="preserve">Figure 9.2: R² and RMSE Before vs After Hyperparameter Tuning</w:t>
+      </w:r>
+    </w:p>
+    <w:p>
+      <w:pPr>
+        <w:spacing w:line="240" w:lineRule="auto"/>
+      </w:pPr>
+      <w:r>
+        <w:drawing>
+          <wp:inline distT="0" distB="0" distL="0" distR="0">
+            <wp:extent cx="4320000" cy="2235711"/>
+            <wp:effectExtent l="0" t="0" r="0" b="0"/>
+            <wp:docPr id="18" name="graph_17.png" descr=""/>
+            <wp:cNvGraphicFramePr>
+              <a:graphicFrameLocks noChangeAspect="1"/>
+            </wp:cNvGraphicFramePr>
+            <a:graphic>
+              <a:graphicData uri="http://schemas.openxmlformats.org/drawingml/2006/picture">
+                <pic:pic>
+                  <pic:nvPicPr>
+                    <pic:cNvPr id="18" name="graph_17.png"/>
+                    <pic:cNvPicPr/>
+                  </pic:nvPicPr>
+                  <pic:blipFill>
+                    <a:blip r:embed="Rdbb3c993f5a74978" cstate="print"/>
+                    <a:stretch>
+                      <a:fillRect/>
+                    </a:stretch>
+                  </pic:blipFill>
+                  <pic:spPr>
+                    <a:xfrm>
+                      <a:off x="0" y="0"/>
+                      <a:ext cx="4320000" cy="2235711"/>
+                    </a:xfrm>
+                    <a:prstGeom prst="rect">
+                      <a:avLst/>
+                    </a:prstGeom>
+                  </pic:spPr>
+                </pic:pic>
+              </a:graphicData>
+            </a:graphic>
+          </wp:inline>
+        </w:drawing>
+      </w:r>
+    </w:p>
+    <w:p>
+      <w:pPr>
+        <w:pStyle w:val="Caption"/>
+        <w:spacing w:after="120"/>
+        <w:jc w:val="center"/>
+      </w:pPr>
+      <w:r>
+        <w:rPr>
+          <w:i/>
+        </w:rPr>
+        <w:t xml:space="preserve">Figure 9.1: GridSearch CV R² Heatmap (n_estimators × max_depth)</w:t>
+      </w:r>
+    </w:p>
     <w:tbl>
       <w:tblPr>
         <w:tblW w:w="5000" w:type="pct"/>
@@ -2230,6 +2948,61 @@
     </w:p>
     <w:p>
       <w:pPr>
+        <w:spacing w:line="240" w:lineRule="auto"/>
+      </w:pPr>
+      <w:r>
+        <w:drawing>
+          <wp:inline distT="0" distB="0" distL="0" distR="0">
+            <wp:extent cx="5400000" cy="2064130"/>
+            <wp:effectExtent l="0" t="0" r="0" b="0"/>
+            <wp:docPr id="12" name="graph_11.png" descr=""/>
+            <wp:cNvGraphicFramePr>
+              <a:graphicFrameLocks noChangeAspect="1"/>
+            </wp:cNvGraphicFramePr>
+            <a:graphic>
+              <a:graphicData uri="http://schemas.openxmlformats.org/drawingml/2006/picture">
+                <pic:pic>
+                  <pic:nvPicPr>
+                    <pic:cNvPr id="12" name="graph_11.png"/>
+                    <pic:cNvPicPr/>
+                  </pic:nvPicPr>
+                  <pic:blipFill>
+                    <a:blip r:embed="R3635db14114a4ed9" cstate="print"/>
+                    <a:stretch>
+                      <a:fillRect/>
+                    </a:stretch>
+                  </pic:blipFill>
+                  <pic:spPr>
+                    <a:xfrm>
+                      <a:off x="0" y="0"/>
+                      <a:ext cx="5400000" cy="2064130"/>
+                    </a:xfrm>
+                    <a:prstGeom prst="rect">
+                      <a:avLst/>
+                    </a:prstGeom>
+                  </pic:spPr>
+                </pic:pic>
+              </a:graphicData>
+            </a:graphic>
+          </wp:inline>
+        </w:drawing>
+      </w:r>
+    </w:p>
+    <w:p>
+      <w:pPr>
+        <w:pStyle w:val="Caption"/>
+        <w:spacing w:after="120"/>
+        <w:jc w:val="center"/>
+      </w:pPr>
+      <w:r>
+        <w:rPr>
+          <w:i/>
+        </w:rPr>
+        <w:t xml:space="preserve">Figure 10.1: Test R² Score — All Models</w:t>
+      </w:r>
+    </w:p>
+    <w:p>
+      <w:pPr>
         <w:spacing w:after="80"/>
       </w:pPr>
       <w:r>
@@ -2241,6 +3014,61 @@
     </w:p>
     <w:p>
       <w:pPr>
+        <w:spacing w:line="240" w:lineRule="auto"/>
+      </w:pPr>
+      <w:r>
+        <w:drawing>
+          <wp:inline distT="0" distB="0" distL="0" distR="0">
+            <wp:extent cx="5400000" cy="2044377"/>
+            <wp:effectExtent l="0" t="0" r="0" b="0"/>
+            <wp:docPr id="13" name="graph_12.png" descr=""/>
+            <wp:cNvGraphicFramePr>
+              <a:graphicFrameLocks noChangeAspect="1"/>
+            </wp:cNvGraphicFramePr>
+            <a:graphic>
+              <a:graphicData uri="http://schemas.openxmlformats.org/drawingml/2006/picture">
+                <pic:pic>
+                  <pic:nvPicPr>
+                    <pic:cNvPr id="13" name="graph_12.png"/>
+                    <pic:cNvPicPr/>
+                  </pic:nvPicPr>
+                  <pic:blipFill>
+                    <a:blip r:embed="R38b97980c1864cd4" cstate="print"/>
+                    <a:stretch>
+                      <a:fillRect/>
+                    </a:stretch>
+                  </pic:blipFill>
+                  <pic:spPr>
+                    <a:xfrm>
+                      <a:off x="0" y="0"/>
+                      <a:ext cx="5400000" cy="2044377"/>
+                    </a:xfrm>
+                    <a:prstGeom prst="rect">
+                      <a:avLst/>
+                    </a:prstGeom>
+                  </pic:spPr>
+                </pic:pic>
+              </a:graphicData>
+            </a:graphic>
+          </wp:inline>
+        </w:drawing>
+      </w:r>
+    </w:p>
+    <w:p>
+      <w:pPr>
+        <w:pStyle w:val="Caption"/>
+        <w:spacing w:after="120"/>
+        <w:jc w:val="center"/>
+      </w:pPr>
+      <w:r>
+        <w:rPr>
+          <w:i/>
+        </w:rPr>
+        <w:t xml:space="preserve">Figure 10.2: Test RMSE &amp; MAE — All Models</w:t>
+      </w:r>
+    </w:p>
+    <w:p>
+      <w:pPr>
         <w:spacing w:after="80"/>
       </w:pPr>
       <w:r>
@@ -2252,6 +3080,116 @@
     </w:p>
     <w:p>
       <w:pPr>
+        <w:spacing w:line="240" w:lineRule="auto"/>
+      </w:pPr>
+      <w:r>
+        <w:drawing>
+          <wp:inline distT="0" distB="0" distL="0" distR="0">
+            <wp:extent cx="5400000" cy="2064130"/>
+            <wp:effectExtent l="0" t="0" r="0" b="0"/>
+            <wp:docPr id="15" name="graph_14.png" descr=""/>
+            <wp:cNvGraphicFramePr>
+              <a:graphicFrameLocks noChangeAspect="1"/>
+            </wp:cNvGraphicFramePr>
+            <a:graphic>
+              <a:graphicData uri="http://schemas.openxmlformats.org/drawingml/2006/picture">
+                <pic:pic>
+                  <pic:nvPicPr>
+                    <pic:cNvPr id="15" name="graph_14.png"/>
+                    <pic:cNvPicPr/>
+                  </pic:nvPicPr>
+                  <pic:blipFill>
+                    <a:blip r:embed="R27f5195feb764fd2" cstate="print"/>
+                    <a:stretch>
+                      <a:fillRect/>
+                    </a:stretch>
+                  </pic:blipFill>
+                  <pic:spPr>
+                    <a:xfrm>
+                      <a:off x="0" y="0"/>
+                      <a:ext cx="5400000" cy="2064130"/>
+                    </a:xfrm>
+                    <a:prstGeom prst="rect">
+                      <a:avLst/>
+                    </a:prstGeom>
+                  </pic:spPr>
+                </pic:pic>
+              </a:graphicData>
+            </a:graphic>
+          </wp:inline>
+        </w:drawing>
+      </w:r>
+    </w:p>
+    <w:p>
+      <w:pPr>
+        <w:pStyle w:val="Caption"/>
+        <w:spacing w:after="120"/>
+        <w:jc w:val="center"/>
+      </w:pPr>
+      <w:r>
+        <w:rPr>
+          <w:i/>
+        </w:rPr>
+        <w:t xml:space="preserve">Figure 10.4: 5-Fold CV R² with Std Dev — All Models</w:t>
+      </w:r>
+    </w:p>
+    <w:p>
+      <w:pPr>
+        <w:spacing w:line="240" w:lineRule="auto"/>
+      </w:pPr>
+      <w:r>
+        <w:drawing>
+          <wp:inline distT="0" distB="0" distL="0" distR="0">
+            <wp:extent cx="5400000" cy="1640217"/>
+            <wp:effectExtent l="0" t="0" r="0" b="0"/>
+            <wp:docPr id="14" name="graph_13.png" descr=""/>
+            <wp:cNvGraphicFramePr>
+              <a:graphicFrameLocks noChangeAspect="1"/>
+            </wp:cNvGraphicFramePr>
+            <a:graphic>
+              <a:graphicData uri="http://schemas.openxmlformats.org/drawingml/2006/picture">
+                <pic:pic>
+                  <pic:nvPicPr>
+                    <pic:cNvPr id="14" name="graph_13.png"/>
+                    <pic:cNvPicPr/>
+                  </pic:nvPicPr>
+                  <pic:blipFill>
+                    <a:blip r:embed="Rde23d625a1f8460c" cstate="print"/>
+                    <a:stretch>
+                      <a:fillRect/>
+                    </a:stretch>
+                  </pic:blipFill>
+                  <pic:spPr>
+                    <a:xfrm>
+                      <a:off x="0" y="0"/>
+                      <a:ext cx="5400000" cy="1640217"/>
+                    </a:xfrm>
+                    <a:prstGeom prst="rect">
+                      <a:avLst/>
+                    </a:prstGeom>
+                  </pic:spPr>
+                </pic:pic>
+              </a:graphicData>
+            </a:graphic>
+          </wp:inline>
+        </w:drawing>
+      </w:r>
+    </w:p>
+    <w:p>
+      <w:pPr>
+        <w:pStyle w:val="Caption"/>
+        <w:spacing w:after="120"/>
+        <w:jc w:val="center"/>
+      </w:pPr>
+      <w:r>
+        <w:rPr>
+          <w:i/>
+        </w:rPr>
+        <w:t xml:space="preserve">Figure 10.3: Test MAPE (%) — All Models</w:t>
+      </w:r>
+    </w:p>
+    <w:p>
+      <w:pPr>
         <w:spacing w:after="160"/>
       </w:pPr>
       <w:r>
@@ -2259,6 +3197,116 @@
           <w:sz w:val="22"/>
         </w:rPr>
         <w:t xml:space="preserve">Chart 4 — Residual Plot: Residuals (actual − predicted) plotted against predicted values. A random scatter around zero indicates well-calibrated predictions with no systematic bias.</w:t>
+      </w:r>
+    </w:p>
+    <w:p>
+      <w:pPr>
+        <w:spacing w:line="240" w:lineRule="auto"/>
+      </w:pPr>
+      <w:r>
+        <w:drawing>
+          <wp:inline distT="0" distB="0" distL="0" distR="0">
+            <wp:extent cx="4680000" cy="2037606"/>
+            <wp:effectExtent l="0" t="0" r="0" b="0"/>
+            <wp:docPr id="17" name="graph_16.png" descr=""/>
+            <wp:cNvGraphicFramePr>
+              <a:graphicFrameLocks noChangeAspect="1"/>
+            </wp:cNvGraphicFramePr>
+            <a:graphic>
+              <a:graphicData uri="http://schemas.openxmlformats.org/drawingml/2006/picture">
+                <pic:pic>
+                  <pic:nvPicPr>
+                    <pic:cNvPr id="17" name="graph_16.png"/>
+                    <pic:cNvPicPr/>
+                  </pic:nvPicPr>
+                  <pic:blipFill>
+                    <a:blip r:embed="R8ad7874039c04ed3" cstate="print"/>
+                    <a:stretch>
+                      <a:fillRect/>
+                    </a:stretch>
+                  </pic:blipFill>
+                  <pic:spPr>
+                    <a:xfrm>
+                      <a:off x="0" y="0"/>
+                      <a:ext cx="4680000" cy="2037606"/>
+                    </a:xfrm>
+                    <a:prstGeom prst="rect">
+                      <a:avLst/>
+                    </a:prstGeom>
+                  </pic:spPr>
+                </pic:pic>
+              </a:graphicData>
+            </a:graphic>
+          </wp:inline>
+        </w:drawing>
+      </w:r>
+    </w:p>
+    <w:p>
+      <w:pPr>
+        <w:pStyle w:val="Caption"/>
+        <w:spacing w:after="120"/>
+        <w:jc w:val="center"/>
+      </w:pPr>
+      <w:r>
+        <w:rPr>
+          <w:i/>
+        </w:rPr>
+        <w:t xml:space="preserve">Figure 10.6: Residual Distribution — Best Model</w:t>
+      </w:r>
+    </w:p>
+    <w:p>
+      <w:pPr>
+        <w:spacing w:line="240" w:lineRule="auto"/>
+      </w:pPr>
+      <w:r>
+        <w:drawing>
+          <wp:inline distT="0" distB="0" distL="0" distR="0">
+            <wp:extent cx="5400000" cy="1899165"/>
+            <wp:effectExtent l="0" t="0" r="0" b="0"/>
+            <wp:docPr id="16" name="graph_15.png" descr=""/>
+            <wp:cNvGraphicFramePr>
+              <a:graphicFrameLocks noChangeAspect="1"/>
+            </wp:cNvGraphicFramePr>
+            <a:graphic>
+              <a:graphicData uri="http://schemas.openxmlformats.org/drawingml/2006/picture">
+                <pic:pic>
+                  <pic:nvPicPr>
+                    <pic:cNvPr id="16" name="graph_15.png"/>
+                    <pic:cNvPicPr/>
+                  </pic:nvPicPr>
+                  <pic:blipFill>
+                    <a:blip r:embed="R7d88f50327c74d4b" cstate="print"/>
+                    <a:stretch>
+                      <a:fillRect/>
+                    </a:stretch>
+                  </pic:blipFill>
+                  <pic:spPr>
+                    <a:xfrm>
+                      <a:off x="0" y="0"/>
+                      <a:ext cx="5400000" cy="1899165"/>
+                    </a:xfrm>
+                    <a:prstGeom prst="rect">
+                      <a:avLst/>
+                    </a:prstGeom>
+                  </pic:spPr>
+                </pic:pic>
+              </a:graphicData>
+            </a:graphic>
+          </wp:inline>
+        </w:drawing>
+      </w:r>
+    </w:p>
+    <w:p>
+      <w:pPr>
+        <w:pStyle w:val="Caption"/>
+        <w:spacing w:after="120"/>
+        <w:jc w:val="center"/>
+      </w:pPr>
+      <w:r>
+        <w:rPr>
+          <w:i/>
+        </w:rPr>
+        <w:t xml:space="preserve">Figure 10.5: Actual vs Predicted &amp; Residual Plot — Best Model</w:t>
       </w:r>
     </w:p>
     <w:p>
@@ -2272,6 +3320,61 @@
           <w:sz w:val="26"/>
         </w:rPr>
         <w:t xml:space="preserve">Final Model Performance (Tuned Random Forest)</w:t>
+      </w:r>
+    </w:p>
+    <w:p>
+      <w:pPr>
+        <w:spacing w:line="240" w:lineRule="auto"/>
+      </w:pPr>
+      <w:r>
+        <w:drawing>
+          <wp:inline distT="0" distB="0" distL="0" distR="0">
+            <wp:extent cx="5040000" cy="1973541"/>
+            <wp:effectExtent l="0" t="0" r="0" b="0"/>
+            <wp:docPr id="20" name="graph_19.png" descr=""/>
+            <wp:cNvGraphicFramePr>
+              <a:graphicFrameLocks noChangeAspect="1"/>
+            </wp:cNvGraphicFramePr>
+            <a:graphic>
+              <a:graphicData uri="http://schemas.openxmlformats.org/drawingml/2006/picture">
+                <pic:pic>
+                  <pic:nvPicPr>
+                    <pic:cNvPr id="20" name="graph_19.png"/>
+                    <pic:cNvPicPr/>
+                  </pic:nvPicPr>
+                  <pic:blipFill>
+                    <a:blip r:embed="Rb6b94e5074fc4479" cstate="print"/>
+                    <a:stretch>
+                      <a:fillRect/>
+                    </a:stretch>
+                  </pic:blipFill>
+                  <pic:spPr>
+                    <a:xfrm>
+                      <a:off x="0" y="0"/>
+                      <a:ext cx="5040000" cy="1973541"/>
+                    </a:xfrm>
+                    <a:prstGeom prst="rect">
+                      <a:avLst/>
+                    </a:prstGeom>
+                  </pic:spPr>
+                </pic:pic>
+              </a:graphicData>
+            </a:graphic>
+          </wp:inline>
+        </w:drawing>
+      </w:r>
+    </w:p>
+    <w:p>
+      <w:pPr>
+        <w:pStyle w:val="Caption"/>
+        <w:spacing w:after="120"/>
+        <w:jc w:val="center"/>
+      </w:pPr>
+      <w:r>
+        <w:rPr>
+          <w:i/>
+        </w:rPr>
+        <w:t xml:space="preserve">Figure 10.7: Sample Predictions — Actual vs Predicted (5 test cars)</w:t>
       </w:r>
     </w:p>
     <w:tbl>

</xml_diff>